<commit_message>
Update project github link document
</commit_message>
<xml_diff>
--- a/Project Github Link.docx
+++ b/Project Github Link.docx
@@ -14,6 +14,7 @@
         <w:adjustRightInd w:val="0"/>
         <w:spacing w:after="0" w:line="240" w:lineRule="auto"/>
         <w:rPr>
+          <w:rStyle w:val="Hyperlink"/>
           <w:rFonts w:asciiTheme="majorHAnsi" w:hAnsiTheme="majorHAnsi"/>
           <w:bCs/>
           <w:sz w:val="24"/>
@@ -79,6 +80,96 @@
         <w:adjustRightInd w:val="0"/>
         <w:spacing w:after="0" w:line="240" w:lineRule="auto"/>
         <w:rPr>
+          <w:rStyle w:val="Hyperlink"/>
+          <w:rFonts w:asciiTheme="majorHAnsi" w:hAnsiTheme="majorHAnsi"/>
+          <w:bCs/>
+          <w:sz w:val="24"/>
+        </w:rPr>
+      </w:pPr>
+    </w:p>
+    <w:p>
+      <w:pPr>
+        <w:widowControl w:val="0"/>
+        <w:tabs>
+          <w:tab w:val="center" w:pos="4320"/>
+          <w:tab w:val="right" w:pos="8640"/>
+        </w:tabs>
+        <w:autoSpaceDE w:val="0"/>
+        <w:autoSpaceDN w:val="0"/>
+        <w:adjustRightInd w:val="0"/>
+        <w:spacing w:after="0" w:line="240" w:lineRule="auto"/>
+        <w:rPr>
+          <w:rFonts w:asciiTheme="majorHAnsi" w:hAnsiTheme="majorHAnsi"/>
+          <w:bCs/>
+          <w:sz w:val="24"/>
+        </w:rPr>
+      </w:pPr>
+      <w:r>
+        <w:rPr>
+          <w:rFonts w:asciiTheme="majorHAnsi" w:hAnsiTheme="majorHAnsi"/>
+          <w:b/>
+          <w:sz w:val="24"/>
+        </w:rPr>
+        <w:t>Deployed</w:t>
+      </w:r>
+      <w:r>
+        <w:rPr>
+          <w:rFonts w:asciiTheme="majorHAnsi" w:hAnsiTheme="majorHAnsi"/>
+          <w:b/>
+          <w:sz w:val="24"/>
+        </w:rPr>
+        <w:t xml:space="preserve"> </w:t>
+      </w:r>
+      <w:proofErr w:type="gramStart"/>
+      <w:r>
+        <w:rPr>
+          <w:rFonts w:asciiTheme="majorHAnsi" w:hAnsiTheme="majorHAnsi"/>
+          <w:b/>
+          <w:sz w:val="24"/>
+        </w:rPr>
+        <w:t>Link</w:t>
+      </w:r>
+      <w:r>
+        <w:rPr>
+          <w:rFonts w:asciiTheme="majorHAnsi" w:hAnsiTheme="majorHAnsi"/>
+          <w:b/>
+          <w:sz w:val="24"/>
+        </w:rPr>
+        <w:t xml:space="preserve"> :</w:t>
+      </w:r>
+      <w:proofErr w:type="gramEnd"/>
+      <w:r>
+        <w:rPr>
+          <w:rFonts w:asciiTheme="majorHAnsi" w:hAnsiTheme="majorHAnsi"/>
+          <w:b/>
+          <w:sz w:val="24"/>
+        </w:rPr>
+        <w:t xml:space="preserve"> </w:t>
+      </w:r>
+      <w:hyperlink r:id="rId9" w:history="1">
+        <w:r>
+          <w:rPr>
+            <w:rStyle w:val="Hyperlink"/>
+            <w:rFonts w:asciiTheme="majorHAnsi" w:hAnsiTheme="majorHAnsi"/>
+            <w:bCs/>
+            <w:sz w:val="24"/>
+          </w:rPr>
+          <w:t>https://mitulmarket.vercel.app/</w:t>
+        </w:r>
+      </w:hyperlink>
+    </w:p>
+    <w:p>
+      <w:pPr>
+        <w:widowControl w:val="0"/>
+        <w:tabs>
+          <w:tab w:val="center" w:pos="4320"/>
+          <w:tab w:val="right" w:pos="8640"/>
+        </w:tabs>
+        <w:autoSpaceDE w:val="0"/>
+        <w:autoSpaceDN w:val="0"/>
+        <w:adjustRightInd w:val="0"/>
+        <w:spacing w:after="0" w:line="240" w:lineRule="auto"/>
+        <w:rPr>
           <w:rFonts w:asciiTheme="majorHAnsi" w:hAnsiTheme="majorHAnsi"/>
           <w:b/>
           <w:sz w:val="24"/>
@@ -98,8 +189,8 @@
       </w:pPr>
     </w:p>
     <w:sectPr>
-      <w:headerReference w:type="default" r:id="rId9"/>
-      <w:footerReference w:type="default" r:id="rId10"/>
+      <w:headerReference w:type="default" r:id="rId10"/>
+      <w:footerReference w:type="default" r:id="rId11"/>
       <w:pgSz w:w="12240" w:h="15840"/>
       <w:pgMar w:top="1440" w:right="1440" w:bottom="1440" w:left="1440" w:header="720" w:footer="720" w:gutter="0"/>
       <w:cols w:space="720"/>
@@ -231,7 +322,7 @@
       <w:rPr>
         <w:noProof/>
       </w:rPr>
-      <w:pict w14:anchorId="50205BB3">
+      <w:pict w14:anchorId="52E7A9D4">
         <v:shapetype id="_x0000_t202" coordsize="21600,21600" o:spt="202" path="m,l,21600r21600,l21600,xe">
           <v:stroke joinstyle="miter"/>
           <v:path gradientshapeok="t" o:connecttype="rect"/>
@@ -1755,6 +1846,7 @@
     <w:rsid w:val="00226C39"/>
     <w:rsid w:val="0028325B"/>
     <w:rsid w:val="002E2B09"/>
+    <w:rsid w:val="004B1C4C"/>
     <w:rsid w:val="004C3A01"/>
     <w:rsid w:val="005D1685"/>
     <w:rsid w:val="005F244A"/>

</xml_diff>